<commit_message>
fix: druid nginx proxy + ingest/avatar tooling + SRS format table
- projects/{demo,_template}/nginx/default.conf: add /druid/ proxy + exclude druid from static cache (was 404 after default.conf simplification)
- test-runner: ingest_matrix.py (12-KB topic x chunk_method, full-format ingest), bigfile_test.py (large-file upload probe), avatar_gen.py (CogView avatar set), ingest_300.py
- SRS 软件需求规格说明书: append chunk_method x supported-format spec table (ragflow v0.18.0) to M1-REQ-004 (.md) + appendix (.docx)
- docs: session summary 2026-06-29
</commit_message>
<xml_diff>
--- a/docs/output/DARPA智能问答服务工具-软件需求规格说明书.docx
+++ b/docs/output/DARPA智能问答服务工具-软件需求规格说明书.docx
@@ -21173,6 +21173,569 @@
         </w:tc>
       </w:tr>
     </w:tbl>
+    <w:p>
+      <w:pPr>
+        <w:pStyle w:val="2"/>
+      </w:pPr>
+      <w:r>
+        <w:t>附录：知识库分块方法与支持文件格式（基于 ragflow v0.18.0 规格）</w:t>
+      </w:r>
+    </w:p>
+    <w:p>
+      <w:r>
+        <w:t>创建知识库时需指定分块方法（chunk_method），每种分块方法对应一组受支持的文件格式。上传文档的格式须与所选分块方法匹配，否则应被拒绝或提示。</w:t>
+      </w:r>
+    </w:p>
+    <w:tbl>
+      <w:tblPr>
+        <w:tblStyle w:val="afb"/>
+        <w:tblW w:type="auto" w:w="0"/>
+        <w:tblLook w:firstColumn="1" w:firstRow="1" w:lastColumn="0" w:lastRow="0" w:noHBand="0" w:noVBand="1" w:val="04A0"/>
+      </w:tblPr>
+      <w:tblGrid>
+        <w:gridCol w:w="3024"/>
+        <w:gridCol w:w="3024"/>
+        <w:gridCol w:w="3024"/>
+      </w:tblGrid>
+      <w:tr>
+        <w:tc>
+          <w:tcPr>
+            <w:tcW w:type="dxa" w:w="3024"/>
+          </w:tcPr>
+          <w:p>
+            <w:r>
+              <w:rPr>
+                <w:sz w:val="20"/>
+              </w:rPr>
+              <w:t>分块方法</w:t>
+            </w:r>
+          </w:p>
+        </w:tc>
+        <w:tc>
+          <w:tcPr>
+            <w:tcW w:type="dxa" w:w="3024"/>
+          </w:tcPr>
+          <w:p>
+            <w:r>
+              <w:rPr>
+                <w:sz w:val="20"/>
+              </w:rPr>
+              <w:t>适用场景</w:t>
+            </w:r>
+          </w:p>
+        </w:tc>
+        <w:tc>
+          <w:tcPr>
+            <w:tcW w:type="dxa" w:w="3024"/>
+          </w:tcPr>
+          <w:p>
+            <w:r>
+              <w:rPr>
+                <w:sz w:val="20"/>
+              </w:rPr>
+              <w:t>支持的文件格式</w:t>
+            </w:r>
+          </w:p>
+        </w:tc>
+      </w:tr>
+      <w:tr>
+        <w:tc>
+          <w:tcPr>
+            <w:tcW w:type="dxa" w:w="3024"/>
+          </w:tcPr>
+          <w:p>
+            <w:r>
+              <w:rPr>
+                <w:sz w:val="20"/>
+              </w:rPr>
+              <w:t>naive（通用）</w:t>
+            </w:r>
+          </w:p>
+        </w:tc>
+        <w:tc>
+          <w:tcPr>
+            <w:tcW w:type="dxa" w:w="3024"/>
+          </w:tcPr>
+          <w:p>
+            <w:r>
+              <w:rPr>
+                <w:sz w:val="20"/>
+              </w:rPr>
+              <w:t>普通军事文档，按语义边界智能分块</w:t>
+            </w:r>
+          </w:p>
+        </w:tc>
+        <w:tc>
+          <w:tcPr>
+            <w:tcW w:type="dxa" w:w="3024"/>
+          </w:tcPr>
+          <w:p>
+            <w:r>
+              <w:rPr>
+                <w:sz w:val="20"/>
+              </w:rPr>
+              <w:t>DOCX、XLSX、XLS、PPT、PDF、TXT、JPEG、JPG、PNG、TIF、GIF、CSV、JSON、EML、HTML</w:t>
+            </w:r>
+          </w:p>
+        </w:tc>
+      </w:tr>
+      <w:tr>
+        <w:tc>
+          <w:tcPr>
+            <w:tcW w:type="dxa" w:w="3024"/>
+          </w:tcPr>
+          <w:p>
+            <w:r>
+              <w:rPr>
+                <w:sz w:val="20"/>
+              </w:rPr>
+              <w:t>book（书籍）</w:t>
+            </w:r>
+          </w:p>
+        </w:tc>
+        <w:tc>
+          <w:tcPr>
+            <w:tcW w:type="dxa" w:w="3024"/>
+          </w:tcPr>
+          <w:p>
+            <w:r>
+              <w:rPr>
+                <w:sz w:val="20"/>
+              </w:rPr>
+              <w:t>书籍/长篇文档分块</w:t>
+            </w:r>
+          </w:p>
+        </w:tc>
+        <w:tc>
+          <w:tcPr>
+            <w:tcW w:type="dxa" w:w="3024"/>
+          </w:tcPr>
+          <w:p>
+            <w:r>
+              <w:rPr>
+                <w:sz w:val="20"/>
+              </w:rPr>
+              <w:t>DOCX、PDF、TXT</w:t>
+            </w:r>
+          </w:p>
+        </w:tc>
+      </w:tr>
+      <w:tr>
+        <w:tc>
+          <w:tcPr>
+            <w:tcW w:type="dxa" w:w="3024"/>
+          </w:tcPr>
+          <w:p>
+            <w:r>
+              <w:rPr>
+                <w:sz w:val="20"/>
+              </w:rPr>
+              <w:t>laws（法规）</w:t>
+            </w:r>
+          </w:p>
+        </w:tc>
+        <w:tc>
+          <w:tcPr>
+            <w:tcW w:type="dxa" w:w="3024"/>
+          </w:tcPr>
+          <w:p>
+            <w:r>
+              <w:rPr>
+                <w:sz w:val="20"/>
+              </w:rPr>
+              <w:t>法规条文，按“第N条”结构分块</w:t>
+            </w:r>
+          </w:p>
+        </w:tc>
+        <w:tc>
+          <w:tcPr>
+            <w:tcW w:type="dxa" w:w="3024"/>
+          </w:tcPr>
+          <w:p>
+            <w:r>
+              <w:rPr>
+                <w:sz w:val="20"/>
+              </w:rPr>
+              <w:t>DOCX、PDF、TXT</w:t>
+            </w:r>
+          </w:p>
+        </w:tc>
+      </w:tr>
+      <w:tr>
+        <w:tc>
+          <w:tcPr>
+            <w:tcW w:type="dxa" w:w="3024"/>
+          </w:tcPr>
+          <w:p>
+            <w:r>
+              <w:rPr>
+                <w:sz w:val="20"/>
+              </w:rPr>
+              <w:t>manual（手册）</w:t>
+            </w:r>
+          </w:p>
+        </w:tc>
+        <w:tc>
+          <w:tcPr>
+            <w:tcW w:type="dxa" w:w="3024"/>
+          </w:tcPr>
+          <w:p>
+            <w:r>
+              <w:rPr>
+                <w:sz w:val="20"/>
+              </w:rPr>
+              <w:t>技术手册分块</w:t>
+            </w:r>
+          </w:p>
+        </w:tc>
+        <w:tc>
+          <w:tcPr>
+            <w:tcW w:type="dxa" w:w="3024"/>
+          </w:tcPr>
+          <w:p>
+            <w:r>
+              <w:rPr>
+                <w:sz w:val="20"/>
+              </w:rPr>
+              <w:t>PDF</w:t>
+            </w:r>
+          </w:p>
+        </w:tc>
+      </w:tr>
+      <w:tr>
+        <w:tc>
+          <w:tcPr>
+            <w:tcW w:type="dxa" w:w="3024"/>
+          </w:tcPr>
+          <w:p>
+            <w:r>
+              <w:rPr>
+                <w:sz w:val="20"/>
+              </w:rPr>
+              <w:t>paper（论文）</w:t>
+            </w:r>
+          </w:p>
+        </w:tc>
+        <w:tc>
+          <w:tcPr>
+            <w:tcW w:type="dxa" w:w="3024"/>
+          </w:tcPr>
+          <w:p>
+            <w:r>
+              <w:rPr>
+                <w:sz w:val="20"/>
+              </w:rPr>
+              <w:t>学术论文分块</w:t>
+            </w:r>
+          </w:p>
+        </w:tc>
+        <w:tc>
+          <w:tcPr>
+            <w:tcW w:type="dxa" w:w="3024"/>
+          </w:tcPr>
+          <w:p>
+            <w:r>
+              <w:rPr>
+                <w:sz w:val="20"/>
+              </w:rPr>
+              <w:t>PDF</w:t>
+            </w:r>
+          </w:p>
+        </w:tc>
+      </w:tr>
+      <w:tr>
+        <w:tc>
+          <w:tcPr>
+            <w:tcW w:type="dxa" w:w="3024"/>
+          </w:tcPr>
+          <w:p>
+            <w:r>
+              <w:rPr>
+                <w:sz w:val="20"/>
+              </w:rPr>
+              <w:t>presentation（演示）</w:t>
+            </w:r>
+          </w:p>
+        </w:tc>
+        <w:tc>
+          <w:tcPr>
+            <w:tcW w:type="dxa" w:w="3024"/>
+          </w:tcPr>
+          <w:p>
+            <w:r>
+              <w:rPr>
+                <w:sz w:val="20"/>
+              </w:rPr>
+              <w:t>演示文稿分块</w:t>
+            </w:r>
+          </w:p>
+        </w:tc>
+        <w:tc>
+          <w:tcPr>
+            <w:tcW w:type="dxa" w:w="3024"/>
+          </w:tcPr>
+          <w:p>
+            <w:r>
+              <w:rPr>
+                <w:sz w:val="20"/>
+              </w:rPr>
+              <w:t>PDF、PPTX</w:t>
+            </w:r>
+          </w:p>
+        </w:tc>
+      </w:tr>
+      <w:tr>
+        <w:tc>
+          <w:tcPr>
+            <w:tcW w:type="dxa" w:w="3024"/>
+          </w:tcPr>
+          <w:p>
+            <w:r>
+              <w:rPr>
+                <w:sz w:val="20"/>
+              </w:rPr>
+              <w:t>one（整块）</w:t>
+            </w:r>
+          </w:p>
+        </w:tc>
+        <w:tc>
+          <w:tcPr>
+            <w:tcW w:type="dxa" w:w="3024"/>
+          </w:tcPr>
+          <w:p>
+            <w:r>
+              <w:rPr>
+                <w:sz w:val="20"/>
+              </w:rPr>
+              <w:t>全文作为单一分块</w:t>
+            </w:r>
+          </w:p>
+        </w:tc>
+        <w:tc>
+          <w:tcPr>
+            <w:tcW w:type="dxa" w:w="3024"/>
+          </w:tcPr>
+          <w:p>
+            <w:r>
+              <w:rPr>
+                <w:sz w:val="20"/>
+              </w:rPr>
+              <w:t>TXT</w:t>
+            </w:r>
+          </w:p>
+        </w:tc>
+      </w:tr>
+      <w:tr>
+        <w:tc>
+          <w:tcPr>
+            <w:tcW w:type="dxa" w:w="3024"/>
+          </w:tcPr>
+          <w:p>
+            <w:r>
+              <w:rPr>
+                <w:sz w:val="20"/>
+              </w:rPr>
+              <w:t>qa（问答）</w:t>
+            </w:r>
+          </w:p>
+        </w:tc>
+        <w:tc>
+          <w:tcPr>
+            <w:tcW w:type="dxa" w:w="3024"/>
+          </w:tcPr>
+          <w:p>
+            <w:r>
+              <w:rPr>
+                <w:sz w:val="20"/>
+              </w:rPr>
+              <w:t>问答对（Q/A）分块</w:t>
+            </w:r>
+          </w:p>
+        </w:tc>
+        <w:tc>
+          <w:tcPr>
+            <w:tcW w:type="dxa" w:w="3024"/>
+          </w:tcPr>
+          <w:p>
+            <w:r>
+              <w:rPr>
+                <w:sz w:val="20"/>
+              </w:rPr>
+              <w:t>XLSX</w:t>
+            </w:r>
+          </w:p>
+        </w:tc>
+      </w:tr>
+      <w:tr>
+        <w:tc>
+          <w:tcPr>
+            <w:tcW w:type="dxa" w:w="3024"/>
+          </w:tcPr>
+          <w:p>
+            <w:r>
+              <w:rPr>
+                <w:sz w:val="20"/>
+              </w:rPr>
+              <w:t>table（表格）</w:t>
+            </w:r>
+          </w:p>
+        </w:tc>
+        <w:tc>
+          <w:tcPr>
+            <w:tcW w:type="dxa" w:w="3024"/>
+          </w:tcPr>
+          <w:p>
+            <w:r>
+              <w:rPr>
+                <w:sz w:val="20"/>
+              </w:rPr>
+              <w:t>结构化表格分块</w:t>
+            </w:r>
+          </w:p>
+        </w:tc>
+        <w:tc>
+          <w:tcPr>
+            <w:tcW w:type="dxa" w:w="3024"/>
+          </w:tcPr>
+          <w:p>
+            <w:r>
+              <w:rPr>
+                <w:sz w:val="20"/>
+              </w:rPr>
+              <w:t>XLSX、CSV/TXT</w:t>
+            </w:r>
+          </w:p>
+        </w:tc>
+      </w:tr>
+      <w:tr>
+        <w:tc>
+          <w:tcPr>
+            <w:tcW w:type="dxa" w:w="3024"/>
+          </w:tcPr>
+          <w:p>
+            <w:r>
+              <w:rPr>
+                <w:sz w:val="20"/>
+              </w:rPr>
+              <w:t>tag（标签）</w:t>
+            </w:r>
+          </w:p>
+        </w:tc>
+        <w:tc>
+          <w:tcPr>
+            <w:tcW w:type="dxa" w:w="3024"/>
+          </w:tcPr>
+          <w:p>
+            <w:r>
+              <w:rPr>
+                <w:sz w:val="20"/>
+              </w:rPr>
+              <w:t>标签集分块</w:t>
+            </w:r>
+          </w:p>
+        </w:tc>
+        <w:tc>
+          <w:tcPr>
+            <w:tcW w:type="dxa" w:w="3024"/>
+          </w:tcPr>
+          <w:p>
+            <w:r>
+              <w:rPr>
+                <w:sz w:val="20"/>
+              </w:rPr>
+              <w:t>XLSX</w:t>
+            </w:r>
+          </w:p>
+        </w:tc>
+      </w:tr>
+      <w:tr>
+        <w:tc>
+          <w:tcPr>
+            <w:tcW w:type="dxa" w:w="3024"/>
+          </w:tcPr>
+          <w:p>
+            <w:r>
+              <w:rPr>
+                <w:sz w:val="20"/>
+              </w:rPr>
+              <w:t>picture（图片）</w:t>
+            </w:r>
+          </w:p>
+        </w:tc>
+        <w:tc>
+          <w:tcPr>
+            <w:tcW w:type="dxa" w:w="3024"/>
+          </w:tcPr>
+          <w:p>
+            <w:r>
+              <w:rPr>
+                <w:sz w:val="20"/>
+              </w:rPr>
+              <w:t>图片经OCR识别后分块</w:t>
+            </w:r>
+          </w:p>
+        </w:tc>
+        <w:tc>
+          <w:tcPr>
+            <w:tcW w:type="dxa" w:w="3024"/>
+          </w:tcPr>
+          <w:p>
+            <w:r>
+              <w:rPr>
+                <w:sz w:val="20"/>
+              </w:rPr>
+              <w:t>JPEG、JPG、PNG、TIF、GIF</w:t>
+            </w:r>
+          </w:p>
+        </w:tc>
+      </w:tr>
+      <w:tr>
+        <w:tc>
+          <w:tcPr>
+            <w:tcW w:type="dxa" w:w="3024"/>
+          </w:tcPr>
+          <w:p>
+            <w:r>
+              <w:rPr>
+                <w:sz w:val="20"/>
+              </w:rPr>
+              <w:t>email（邮件）</w:t>
+            </w:r>
+          </w:p>
+        </w:tc>
+        <w:tc>
+          <w:tcPr>
+            <w:tcW w:type="dxa" w:w="3024"/>
+          </w:tcPr>
+          <w:p>
+            <w:r>
+              <w:rPr>
+                <w:sz w:val="20"/>
+              </w:rPr>
+              <w:t>邮件正文分块</w:t>
+            </w:r>
+          </w:p>
+        </w:tc>
+        <w:tc>
+          <w:tcPr>
+            <w:tcW w:type="dxa" w:w="3024"/>
+          </w:tcPr>
+          <w:p>
+            <w:r>
+              <w:rPr>
+                <w:sz w:val="20"/>
+              </w:rPr>
+              <w:t>EML</w:t>
+            </w:r>
+          </w:p>
+        </w:tc>
+      </w:tr>
+    </w:tbl>
+    <w:p>
+      <w:r>
+        <w:t>注：resume（简历）与 knowledge_graph（知识图谱）分块方法 ragflow v0.18.0 的知识库创建接口不对外暴露（resume）或需额外图谱抽取模型（knowledge_graph），本系统不纳入对外分块方法范围。</w:t>
+      </w:r>
+    </w:p>
     <w:sectPr>
       <w:pgSz w:w="11906" w:h="16838"/>
       <w:pgMar w:top="1418" w:right="1134" w:bottom="1418" w:left="1701" w:header="1077" w:footer="680" w:gutter="0"/>

</xml_diff>